<commit_message>
final submission done on 15-Aug at 7:53 pm
</commit_message>
<xml_diff>
--- a/final_report.docx
+++ b/final_report.docx
@@ -93,10 +93,7 @@
         <w:spacing w:after="100" w:line="250" w:lineRule="auto"/>
       </w:pPr>
       <w:r>
-        <w:t>Sahayak Health AI is a decision-support tool for ASHA (Accredited Social Health Activist) workers, community health volunteers who serve as the first point of contact for medical concerns in rural India. The representative user, Priya, has no doctor immediately available in her area. For each patient, she must decide — based only on their spoken description of symptoms — whether the appropriate next step is to wait at home, seek a same-day doctor visit, or go to the emergency room. Sahayak supports this dec</w:t>
-      </w:r>
-      <w:r>
-        <w:t>ision. It does not name a diagnosis and does not recommend a medicine; its sole output is one of three care-seeking levels, accompanied by a short, plain-language explanation.</w:t>
+        <w:t>Sahayak Health AI is a decision-support tool for ASHA (Accredited Social Health Activist) workers, community health volunteers who serve as the first point of contact for medical concerns in rural India. The representative user, Priya, has no doctor immediately available in her area. For each patient, she must decide — based only on their spoken description of symptoms — whether the appropriate next step is to wait at home, seek a same-day doctor visit, or go to the emergency room. Sahayak supports this decision. It does not name a diagnosis and does not recommend a medicine; its sole output is one of three care-seeking levels, accompanied by a short, plain-language explanation.</w:t>
       </w:r>
     </w:p>
     <w:p>
@@ -124,10 +121,7 @@
         <w:spacing w:after="100" w:line="250" w:lineRule="auto"/>
       </w:pPr>
       <w:r>
-        <w:t>Triage is not a symmetric classification problem. Sending a genuinely sick patient home (under-triage) can cost a life; sending a self-limiting case to a doctor unnecessarily (over-triage) consumes clinic capacity but causes no direct harm. The American College of Surgeons (ACS) field-triage standard reflects this asymmetry explicitly, accepting up to 35–50% over-triage as the price of keeping under-triage at or below 5%. Sahayak is designed and evaluated against this same standard rather than against raw a</w:t>
-      </w:r>
-      <w:r>
-        <w:t>ccuracy. The system’s scope is deliberately narrow: it does not diagnose, does not name or dose medicines, and does not substitute for a qualified professional. Every response includes a disclaimer to that effect.</w:t>
+        <w:t>Triage is not a symmetric classification problem. Sending a genuinely sick patient home (under-triage) can cost a life; sending a self-limiting case to a doctor unnecessarily (over-triage) consumes clinic capacity but causes no direct harm. The American College of Surgeons (ACS) field-triage standard reflects this asymmetry explicitly, accepting up to 35–50% over-triage as the price of keeping under-triage at or below 5%. Sahayak is designed and evaluated against this same standard rather than against raw accuracy. The system’s scope is deliberately narrow: it does not diagnose, does not name or dose medicines, and does not substitute for a qualified professional. Every response includes a disclaimer to that effect.</w:t>
       </w:r>
     </w:p>
     <w:p>
@@ -1617,9 +1611,9 @@
           <w:noProof/>
         </w:rPr>
         <w:drawing>
-          <wp:inline distT="0" distB="0" distL="0" distR="0" wp14:anchorId="14C14F41" wp14:editId="59E626C6">
-            <wp:extent cx="4420828" cy="2826913"/>
-            <wp:effectExtent l="0" t="0" r="0" b="0"/>
+          <wp:inline distT="0" distB="0" distL="0" distR="0" wp14:anchorId="14C14F41" wp14:editId="40CFB4B4">
+            <wp:extent cx="5076825" cy="2826385"/>
+            <wp:effectExtent l="0" t="0" r="9525" b="0"/>
             <wp:docPr id="1900057738" name="Picture 5"/>
             <wp:cNvGraphicFramePr>
               <a:graphicFrameLocks xmlns:a="http://schemas.openxmlformats.org/drawingml/2006/main" noChangeAspect="1"/>
@@ -1646,7 +1640,7 @@
                   <pic:spPr>
                     <a:xfrm>
                       <a:off x="0" y="0"/>
-                      <a:ext cx="4454890" cy="2848694"/>
+                      <a:ext cx="5120784" cy="2850858"/>
                     </a:xfrm>
                     <a:prstGeom prst="rect">
                       <a:avLst/>
@@ -2901,14 +2895,7 @@
                 <w:sz w:val="17"/>
                 <w:szCs w:val="17"/>
               </w:rPr>
-              <w:t>−</w:t>
-            </w:r>
-            <w:r>
-              <w:rPr>
-                <w:sz w:val="17"/>
-                <w:szCs w:val="17"/>
-              </w:rPr>
-              <w:t xml:space="preserve">52.0 </w:t>
+              <w:t xml:space="preserve">−52.0 </w:t>
             </w:r>
           </w:p>
         </w:tc>
@@ -3348,14 +3335,7 @@
                 <w:sz w:val="17"/>
                 <w:szCs w:val="17"/>
               </w:rPr>
-              <w:t>−</w:t>
-            </w:r>
-            <w:r>
-              <w:rPr>
-                <w:sz w:val="17"/>
-                <w:szCs w:val="17"/>
-              </w:rPr>
-              <w:t>8.0 pp</w:t>
+              <w:t>−8.0 pp</w:t>
             </w:r>
           </w:p>
         </w:tc>
@@ -3478,14 +3458,7 @@
                 <w:sz w:val="17"/>
                 <w:szCs w:val="17"/>
               </w:rPr>
-              <w:t>−</w:t>
-            </w:r>
-            <w:r>
-              <w:rPr>
-                <w:sz w:val="17"/>
-                <w:szCs w:val="17"/>
-              </w:rPr>
-              <w:t>11.8 pp</w:t>
+              <w:t>−11.8 pp</w:t>
             </w:r>
           </w:p>
         </w:tc>
@@ -3604,14 +3577,7 @@
                 <w:sz w:val="17"/>
                 <w:szCs w:val="17"/>
               </w:rPr>
-              <w:t>−</w:t>
-            </w:r>
-            <w:r>
-              <w:rPr>
-                <w:sz w:val="17"/>
-                <w:szCs w:val="17"/>
-              </w:rPr>
-              <w:t>11.7 pp</w:t>
+              <w:t>−11.7 pp</w:t>
             </w:r>
           </w:p>
         </w:tc>
@@ -3976,14 +3942,7 @@
                 <w:sz w:val="17"/>
                 <w:szCs w:val="17"/>
               </w:rPr>
-              <w:t>−</w:t>
-            </w:r>
-            <w:r>
-              <w:rPr>
-                <w:sz w:val="17"/>
-                <w:szCs w:val="17"/>
-              </w:rPr>
-              <w:t>4.0 pp</w:t>
+              <w:t>−4.0 pp</w:t>
             </w:r>
           </w:p>
         </w:tc>
@@ -4009,10 +3968,7 @@
         <w:t>WAIT recall falls from 29.4% to 17.6% and overall accuracy falls from 60.0% to 52.0%, because more borderline cases are now escalated</w:t>
       </w:r>
       <w:r>
-        <w:t>. ER recall and under-triage remain essentially unchanged and stay well within their safety thresholds. Given the project’s stated priority — safety over accuracy — the calibrated v2 agent is the version carried forward as the final system, and the accuracy shortfall was not expected and is treated as an open item for future work rather than a safety failure. Therefore, the optimisation improved the safety profile relative to the rule-based baseline but did not improve overall classification accuracy relati</w:t>
-      </w:r>
-      <w:r>
-        <w:t>ve to the pre-calibration ADK agent.</w:t>
+        <w:t>. ER recall and under-triage remain essentially unchanged and stay well within their safety thresholds. Given the project’s stated priority — safety over accuracy — the calibrated v2 agent is the version carried forward as the final system, and the accuracy shortfall was not expected and is treated as an open item for future work rather than a safety failure. Therefore, the optimisation improved the safety profile relative to the rule-based baseline but did not improve overall classification accuracy relative to the pre-calibration ADK agent.</w:t>
       </w:r>
     </w:p>
     <w:p>
@@ -5238,12 +5194,6 @@
     <w:p>
       <w:pPr>
         <w:pStyle w:val="Heading1"/>
-        <w:pBdr>
-          <w:bottom w:val="single" w:sz="6" w:space="3" w:color="000000"/>
-        </w:pBdr>
-        <w:spacing w:before="220" w:after="100"/>
-      </w:pPr>
-      <w:r>
         <w:rPr>
           <w:b/>
           <w:bCs/>
@@ -5251,70 +5201,11 @@
           <w:sz w:val="26"/>
           <w:szCs w:val="26"/>
         </w:rPr>
-        <w:t>5. Known Limits</w:t>
-      </w:r>
+      </w:pPr>
     </w:p>
     <w:p>
       <w:pPr>
-        <w:pStyle w:val="ListParagraph"/>
-        <w:numPr>
-          <w:ilvl w:val="0"/>
-          <w:numId w:val="1"/>
-        </w:numPr>
-        <w:spacing w:after="55" w:line="245" w:lineRule="auto"/>
-      </w:pPr>
-      <w:r>
-        <w:t>Model accuracy ceiling. The final exact accuracy of 52.0% is below the project’s 60% stretch target, but remains within the 34–60% range reported for LLM-based triage in the cited literature. Human inter-rater agreement also indicates that exact triage labels are inherently difficult to reproduce.</w:t>
-      </w:r>
-    </w:p>
-    <w:p>
-      <w:pPr>
-        <w:pStyle w:val="ListParagraph"/>
-        <w:numPr>
-          <w:ilvl w:val="0"/>
-          <w:numId w:val="1"/>
-        </w:numPr>
-        <w:spacing w:after="55" w:line="245" w:lineRule="auto"/>
-      </w:pPr>
-      <w:r>
-        <w:t>Dataset label noise. Ground truth is derived from a 22-diagnosis label attached to first-person symptom text via TRIAGE_MAP. Certain presentations — hepatitis-pattern symptoms, for example — cannot be reliably separated from text alone, which imposes an irreducible noise floor that no amount of prompt engineering can eliminate.</w:t>
-      </w:r>
-    </w:p>
-    <w:p>
-      <w:pPr>
-        <w:pStyle w:val="ListParagraph"/>
-        <w:numPr>
-          <w:ilvl w:val="0"/>
-          <w:numId w:val="1"/>
-        </w:numPr>
-        <w:spacing w:after="55" w:line="245" w:lineRule="auto"/>
-      </w:pPr>
-      <w:r>
-        <w:t>Not a medical device. Sahayak produces decision-support guidance only. It does not diagnose, does not prescribe, and includes a disclaimer on every response. It has not been validated against a clinical device standard and is not intended for that use.</w:t>
-      </w:r>
-    </w:p>
-    <w:p>
-      <w:pPr>
-        <w:pStyle w:val="ListParagraph"/>
-        <w:numPr>
-          <w:ilvl w:val="0"/>
-          <w:numId w:val="1"/>
-        </w:numPr>
-        <w:spacing w:after="55" w:line="245" w:lineRule="auto"/>
-      </w:pPr>
-      <w:r>
-        <w:t>Single-run, small-sample variance. All figures reported here come from a single 50-case run against a temperature-based model (Gemini 2.5 Flash), which introduces visible run-to-run variance. Confidence intervals are correspondingly wide, particularly for the ER class (n = 16).</w:t>
-      </w:r>
-    </w:p>
-    <w:p>
-      <w:pPr>
         <w:pStyle w:val="Heading1"/>
-        <w:pBdr>
-          <w:bottom w:val="single" w:sz="6" w:space="3" w:color="000000"/>
-        </w:pBdr>
-        <w:spacing w:before="220" w:after="100"/>
-      </w:pPr>
-      <w:r>
         <w:rPr>
           <w:b/>
           <w:bCs/>
@@ -5322,48 +5213,6 @@
           <w:sz w:val="26"/>
           <w:szCs w:val="26"/>
         </w:rPr>
-        <w:lastRenderedPageBreak/>
-        <w:t>6. Patient Stories</w:t>
-      </w:r>
-    </w:p>
-    <w:p>
-      <w:pPr>
-        <w:spacing w:after="100" w:line="250" w:lineRule="auto"/>
-      </w:pPr>
-      <w:r>
-        <w:t>The following three traced runs illustrate the system’s behaviour in language suitable for a non-technical reviewer.</w:t>
-      </w:r>
-    </w:p>
-    <w:p>
-      <w:pPr>
-        <w:spacing w:after="100" w:line="250" w:lineRule="auto"/>
-      </w:pPr>
-      <w:r>
-        <w:t>WAIT. Patient: “I have mild itching on my forearm for two days. No fever.” Sahayak’s response recommends WAIT, explaining that mild itching without fever or other concerning signs does not appear urgent, and asks a brief follow-up question about rash, redness, or swelling to remain alert to change.</w:t>
-      </w:r>
-    </w:p>
-    <w:p>
-      <w:pPr>
-        <w:spacing w:after="100" w:line="250" w:lineRule="auto"/>
-      </w:pPr>
-      <w:r>
-        <w:t>DOCTOR. Patient: “My uncle is 60 and diabetic, taking metformin. Loose motions and vomiting since morning, feels very weak.” Sahayak recommends a same-day doctor visit, citing the patient’s age, diabetes, and current medication as reasons for clinical evaluation. The response also includes a medicine-relay note instructing the worker to inform the doctor of the current medication without altering the dose — a direct illustration of the never-diagnose, never-prescribe rule in practice.</w:t>
-      </w:r>
-    </w:p>
-    <w:p>
-      <w:pPr>
-        <w:spacing w:after="100" w:line="250" w:lineRule="auto"/>
-      </w:pPr>
-      <w:r>
-        <w:t>ER. Patient: “Chest pain, cannot breathe, left arm feels numb, sweating a lot.” This combination of symptoms is a recognised cardiac emergency pattern. Sahayak scores the severity at 5 and recommends immediate emergency care, directing the worker to call for an ambulance or proceed to the nearest hospital, without attempting to name the underlying condition.</w:t>
-      </w:r>
-    </w:p>
-    <w:p>
-      <w:pPr>
-        <w:pStyle w:val="Heading1"/>
-        <w:rPr>
-          <w:color w:val="auto"/>
-        </w:rPr>
       </w:pPr>
       <w:r>
         <w:rPr>
@@ -5373,9 +5222,17 @@
           <w:sz w:val="26"/>
           <w:szCs w:val="26"/>
         </w:rPr>
-        <w:t>7</w:t>
-      </w:r>
-      <w:r>
+        <w:t>5. Dashboard Screenshots</w:t>
+      </w:r>
+    </w:p>
+    <w:p>
+      <w:r>
+        <w:t>Simple Demo Screenshot</w:t>
+      </w:r>
+    </w:p>
+    <w:p>
+      <w:pPr>
+        <w:pStyle w:val="Heading1"/>
         <w:rPr>
           <w:b/>
           <w:bCs/>
@@ -5383,7 +5240,285 @@
           <w:sz w:val="26"/>
           <w:szCs w:val="26"/>
         </w:rPr>
-        <w:t>. Recommendations</w:t>
+      </w:pPr>
+      <w:r>
+        <w:rPr>
+          <w:b/>
+          <w:bCs/>
+          <w:noProof/>
+          <w:color w:val="000000"/>
+          <w:sz w:val="26"/>
+          <w:szCs w:val="26"/>
+        </w:rPr>
+        <w:lastRenderedPageBreak/>
+        <w:drawing>
+          <wp:inline distT="0" distB="0" distL="0" distR="0" wp14:anchorId="46200054" wp14:editId="060A3890">
+            <wp:extent cx="6502400" cy="6621780"/>
+            <wp:effectExtent l="0" t="0" r="0" b="7620"/>
+            <wp:docPr id="1675292346" name="Picture 1"/>
+            <wp:cNvGraphicFramePr>
+              <a:graphicFrameLocks xmlns:a="http://schemas.openxmlformats.org/drawingml/2006/main" noChangeAspect="1"/>
+            </wp:cNvGraphicFramePr>
+            <a:graphic xmlns:a="http://schemas.openxmlformats.org/drawingml/2006/main">
+              <a:graphicData uri="http://schemas.openxmlformats.org/drawingml/2006/picture">
+                <pic:pic xmlns:pic="http://schemas.openxmlformats.org/drawingml/2006/picture">
+                  <pic:nvPicPr>
+                    <pic:cNvPr id="1675292346" name=""/>
+                    <pic:cNvPicPr/>
+                  </pic:nvPicPr>
+                  <pic:blipFill>
+                    <a:blip r:embed="rId7"/>
+                    <a:stretch>
+                      <a:fillRect/>
+                    </a:stretch>
+                  </pic:blipFill>
+                  <pic:spPr>
+                    <a:xfrm>
+                      <a:off x="0" y="0"/>
+                      <a:ext cx="6502400" cy="6621780"/>
+                    </a:xfrm>
+                    <a:prstGeom prst="rect">
+                      <a:avLst/>
+                    </a:prstGeom>
+                  </pic:spPr>
+                </pic:pic>
+              </a:graphicData>
+            </a:graphic>
+          </wp:inline>
+        </w:drawing>
+      </w:r>
+    </w:p>
+    <w:p>
+      <w:pPr>
+        <w:pStyle w:val="Heading1"/>
+        <w:rPr>
+          <w:b/>
+          <w:bCs/>
+          <w:color w:val="000000"/>
+          <w:sz w:val="26"/>
+          <w:szCs w:val="26"/>
+        </w:rPr>
+      </w:pPr>
+    </w:p>
+    <w:p>
+      <w:pPr>
+        <w:pStyle w:val="Heading1"/>
+        <w:rPr>
+          <w:b/>
+          <w:bCs/>
+          <w:color w:val="000000"/>
+          <w:sz w:val="26"/>
+          <w:szCs w:val="26"/>
+        </w:rPr>
+      </w:pPr>
+      <w:r>
+        <w:rPr>
+          <w:b/>
+          <w:bCs/>
+          <w:color w:val="000000"/>
+          <w:sz w:val="26"/>
+          <w:szCs w:val="26"/>
+        </w:rPr>
+        <w:t>Trust Dashboard</w:t>
+      </w:r>
+    </w:p>
+    <w:p>
+      <w:pPr>
+        <w:pStyle w:val="Heading1"/>
+        <w:rPr>
+          <w:b/>
+          <w:bCs/>
+          <w:color w:val="000000"/>
+          <w:sz w:val="26"/>
+          <w:szCs w:val="26"/>
+        </w:rPr>
+      </w:pPr>
+      <w:r>
+        <w:rPr>
+          <w:b/>
+          <w:bCs/>
+          <w:noProof/>
+          <w:color w:val="000000"/>
+          <w:sz w:val="26"/>
+          <w:szCs w:val="26"/>
+        </w:rPr>
+        <w:lastRenderedPageBreak/>
+        <w:drawing>
+          <wp:inline distT="0" distB="0" distL="0" distR="0" wp14:anchorId="0F4BB903" wp14:editId="1998059D">
+            <wp:extent cx="6502400" cy="5417185"/>
+            <wp:effectExtent l="0" t="0" r="0" b="0"/>
+            <wp:docPr id="1155776252" name="Picture 1"/>
+            <wp:cNvGraphicFramePr>
+              <a:graphicFrameLocks xmlns:a="http://schemas.openxmlformats.org/drawingml/2006/main" noChangeAspect="1"/>
+            </wp:cNvGraphicFramePr>
+            <a:graphic xmlns:a="http://schemas.openxmlformats.org/drawingml/2006/main">
+              <a:graphicData uri="http://schemas.openxmlformats.org/drawingml/2006/picture">
+                <pic:pic xmlns:pic="http://schemas.openxmlformats.org/drawingml/2006/picture">
+                  <pic:nvPicPr>
+                    <pic:cNvPr id="1155776252" name=""/>
+                    <pic:cNvPicPr/>
+                  </pic:nvPicPr>
+                  <pic:blipFill>
+                    <a:blip r:embed="rId8"/>
+                    <a:stretch>
+                      <a:fillRect/>
+                    </a:stretch>
+                  </pic:blipFill>
+                  <pic:spPr>
+                    <a:xfrm>
+                      <a:off x="0" y="0"/>
+                      <a:ext cx="6502400" cy="5417185"/>
+                    </a:xfrm>
+                    <a:prstGeom prst="rect">
+                      <a:avLst/>
+                    </a:prstGeom>
+                  </pic:spPr>
+                </pic:pic>
+              </a:graphicData>
+            </a:graphic>
+          </wp:inline>
+        </w:drawing>
+      </w:r>
+    </w:p>
+    <w:p>
+      <w:pPr>
+        <w:pStyle w:val="Heading1"/>
+        <w:pBdr>
+          <w:bottom w:val="single" w:sz="6" w:space="3" w:color="000000"/>
+        </w:pBdr>
+        <w:spacing w:before="220" w:after="100"/>
+      </w:pPr>
+      <w:r>
+        <w:rPr>
+          <w:b/>
+          <w:bCs/>
+          <w:color w:val="000000"/>
+          <w:sz w:val="26"/>
+          <w:szCs w:val="26"/>
+        </w:rPr>
+        <w:t>6. Known Limits</w:t>
+      </w:r>
+    </w:p>
+    <w:p>
+      <w:pPr>
+        <w:pStyle w:val="ListParagraph"/>
+        <w:numPr>
+          <w:ilvl w:val="0"/>
+          <w:numId w:val="1"/>
+        </w:numPr>
+        <w:spacing w:after="55" w:line="245" w:lineRule="auto"/>
+      </w:pPr>
+      <w:r>
+        <w:t>Model accuracy ceiling. The final exact accuracy of 52.0% is below the project’s 60% stretch target, but remains within the 34–60% range reported for LLM-based triage in the cited literature. Human inter-rater agreement also indicates that exact triage labels are inherently difficult to reproduce.</w:t>
+      </w:r>
+    </w:p>
+    <w:p>
+      <w:pPr>
+        <w:pStyle w:val="ListParagraph"/>
+        <w:numPr>
+          <w:ilvl w:val="0"/>
+          <w:numId w:val="1"/>
+        </w:numPr>
+        <w:spacing w:after="55" w:line="245" w:lineRule="auto"/>
+      </w:pPr>
+      <w:r>
+        <w:t>Dataset label noise. Ground truth is derived from a 22-diagnosis label attached to first-person symptom text via TRIAGE_MAP. Certain presentations — hepatitis-pattern symptoms, for example — cannot be reliably separated from text alone, which imposes an irreducible noise floor that no amount of prompt engineering can eliminate.</w:t>
+      </w:r>
+    </w:p>
+    <w:p>
+      <w:pPr>
+        <w:pStyle w:val="ListParagraph"/>
+        <w:numPr>
+          <w:ilvl w:val="0"/>
+          <w:numId w:val="1"/>
+        </w:numPr>
+        <w:spacing w:after="55" w:line="245" w:lineRule="auto"/>
+      </w:pPr>
+      <w:r>
+        <w:t>Not a medical device. Sahayak produces decision-support guidance only. It does not diagnose, does not prescribe, and includes a disclaimer on every response. It has not been validated against a clinical device standard and is not intended for that use.</w:t>
+      </w:r>
+    </w:p>
+    <w:p>
+      <w:pPr>
+        <w:pStyle w:val="ListParagraph"/>
+        <w:numPr>
+          <w:ilvl w:val="0"/>
+          <w:numId w:val="1"/>
+        </w:numPr>
+        <w:spacing w:after="55" w:line="245" w:lineRule="auto"/>
+      </w:pPr>
+      <w:r>
+        <w:t>Single-run, small-sample variance. All figures reported here come from a single 50-case run against a temperature-based model (Gemini 2.5 Flash), which introduces visible run-to-run variance. Confidence intervals are correspondingly wide, particularly for the ER class (n = 16).</w:t>
+      </w:r>
+    </w:p>
+    <w:p>
+      <w:pPr>
+        <w:pStyle w:val="Heading1"/>
+        <w:pBdr>
+          <w:bottom w:val="single" w:sz="6" w:space="3" w:color="000000"/>
+        </w:pBdr>
+        <w:spacing w:before="220" w:after="100"/>
+      </w:pPr>
+      <w:r>
+        <w:rPr>
+          <w:b/>
+          <w:bCs/>
+          <w:color w:val="000000"/>
+          <w:sz w:val="26"/>
+          <w:szCs w:val="26"/>
+        </w:rPr>
+        <w:t>7. Patient Stories</w:t>
+      </w:r>
+    </w:p>
+    <w:p>
+      <w:pPr>
+        <w:spacing w:after="100" w:line="250" w:lineRule="auto"/>
+      </w:pPr>
+      <w:r>
+        <w:t>The following three traced runs illustrate the system’s behaviour in language suitable for a non-technical reviewer.</w:t>
+      </w:r>
+    </w:p>
+    <w:p>
+      <w:pPr>
+        <w:spacing w:after="100" w:line="250" w:lineRule="auto"/>
+      </w:pPr>
+      <w:r>
+        <w:t>WAIT. Patient: “I have mild itching on my forearm for two days. No fever.” Sahayak’s response recommends WAIT, explaining that mild itching without fever or other concerning signs does not appear urgent, and asks a brief follow-up question about rash, redness, or swelling to remain alert to change.</w:t>
+      </w:r>
+    </w:p>
+    <w:p>
+      <w:pPr>
+        <w:spacing w:after="100" w:line="250" w:lineRule="auto"/>
+      </w:pPr>
+      <w:r>
+        <w:lastRenderedPageBreak/>
+        <w:t>DOCTOR. Patient: “My uncle is 60 and diabetic, taking metformin. Loose motions and vomiting since morning, feels very weak.” Sahayak recommends a same-day doctor visit, citing the patient’s age, diabetes, and current medication as reasons for clinical evaluation. The response also includes a medicine-relay note instructing the worker to inform the doctor of the current medication without altering the dose — a direct illustration of the never-diagnose, never-prescribe rule in practice.</w:t>
+      </w:r>
+    </w:p>
+    <w:p>
+      <w:pPr>
+        <w:spacing w:after="100" w:line="250" w:lineRule="auto"/>
+      </w:pPr>
+      <w:r>
+        <w:t>ER. Patient: “Chest pain, cannot breathe, left arm feels numb, sweating a lot.” This combination of symptoms is a recognised cardiac emergency pattern. Sahayak scores the severity at 5 and recommends immediate emergency care, directing the worker to call for an ambulance or proceed to the nearest hospital, without attempting to name the underlying condition.</w:t>
+      </w:r>
+    </w:p>
+    <w:p>
+      <w:pPr>
+        <w:pStyle w:val="Heading1"/>
+        <w:rPr>
+          <w:color w:val="auto"/>
+        </w:rPr>
+      </w:pPr>
+      <w:r>
+        <w:rPr>
+          <w:b/>
+          <w:bCs/>
+          <w:color w:val="000000"/>
+          <w:sz w:val="26"/>
+          <w:szCs w:val="26"/>
+        </w:rPr>
+        <w:t>8. Recommendations</w:t>
       </w:r>
     </w:p>
     <w:p>
@@ -5542,7 +5677,7 @@
           </mc:Choice>
           <mc:Fallback>
             <w:pict>
-              <v:line w14:anchorId="19297BA7" id="Straight Connector 2" o:spid="_x0000_s1026" style="position:absolute;flip:y;z-index:251659264;visibility:visible;mso-wrap-style:square;mso-wrap-distance-left:9pt;mso-wrap-distance-top:0;mso-wrap-distance-right:9pt;mso-wrap-distance-bottom:0;mso-position-horizontal:absolute;mso-position-horizontal-relative:text;mso-position-vertical:absolute;mso-position-vertical-relative:text" from="-2.6pt,1.55pt" to="507pt,3.6pt" o:gfxdata="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" strokecolor="#156082 [3204]" strokeweight="1.5pt">
+              <v:line w14:anchorId="19297BA7" id="Straight Connector 2" o:spid="_x0000_s1026" style="position:absolute;flip:y;z-index:251659264;visibility:visible;mso-wrap-style:square;mso-wrap-distance-left:9pt;mso-wrap-distance-top:0;mso-wrap-distance-right:9pt;mso-wrap-distance-bottom:0;mso-position-horizontal:absolute;mso-position-horizontal-relative:text;mso-position-vertical:absolute;mso-position-vertical-relative:text" from="-2.6pt,1.55pt" to="507pt,3.6pt" o:gfxdata="UEsDBBQABgAIAAAAIQC2gziS/gAAAOEBAAATAAAAW0NvbnRlbnRfVHlwZXNdLnhtbJSRQU7DMBBF 90jcwfIWJU67QAgl6YK0S0CoHGBkTxKLZGx5TGhvj5O2G0SRWNoz/78nu9wcxkFMGNg6quQqL6RA 0s5Y6ir5vt9lD1JwBDIwOMJKHpHlpr69KfdHjyxSmriSfYz+USnWPY7AufNIadK6MEJMx9ApD/oD OlTrorhX2lFEilmcO2RdNtjC5xDF9pCuTyYBB5bi6bQ4syoJ3g9WQ0ymaiLzg5KdCXlKLjvcW893 SUOqXwnz5DrgnHtJTxOsQfEKIT7DmDSUCaxw7Rqn8787ZsmRM9e2VmPeBN4uqYvTtW7jvijg9N/y JsXecLq0q+WD6m8AAAD//wMAUEsDBBQABgAIAAAAIQA4/SH/1gAAAJQBAAALAAAAX3JlbHMvLnJl bHOkkMFqwzAMhu+DvYPRfXGawxijTi+j0GvpHsDYimMaW0Yy2fr2M4PBMnrbUb/Q94l/f/hMi1qR JVI2sOt6UJgd+ZiDgffL8ekFlFSbvV0oo4EbChzGx4f9GRdb25HMsYhqlCwG5lrLq9biZkxWOiqY 22YiTra2kYMu1l1tQD30/bPm3wwYN0x18gb45AdQl1tp5j/sFB2T0FQ7R0nTNEV3j6o9feQzro1i OWA14Fm+Q8a1a8+Bvu/d/dMb2JY5uiPbhG/ktn4cqGU/er3pcvwCAAD//wMAUEsDBBQABgAIAAAA IQBB4bxaqwEAAKIDAAAOAAAAZHJzL2Uyb0RvYy54bWysU8tu2zAQvBfIPxC8x5KdxAkEyzkkaC9F G/R1Z6ilRYAvkKwl/32XK1sJ2iIBglwIkrszuzNcbm5Ha9geYtLetXy5qDkDJ32n3a7lP398PL/h LGXhOmG8g5YfIPHb7dmHzRAaWPnemw4iQxKXmiG0vM85NFWVZA9WpIUP4DCofLQi4zHuqi6KAdmt qVZ1va4GH7sQvYSU8PZ+CvIt8SsFMn9VKkFmpuXYW6Y10vpY1mq7Ec0uitBreWxDvKELK7TDojPV vciC/Y76HyqrZfTJq7yQ3lZeKS2BNKCaZf2Xmu+9CEBa0JwUZpvS+9HKL/s79xDRhiGkJoWHWFSM KlqmjA6/8E1JF3bKRrLtMNsGY2YSL9eX18v1xSVnEmOrq+urm2JrNdEUuhBT/gTesrJpudGuqBKN 2H9OeUo9pSDuqRHa5YOBkmzcN1BMd1hwRWiaEbgzke0Fvq6QElxeHktTdoEpbcwMrF8HHvMLFGh+ ZvBkxItVZwRV9i7PYKudj/+rnsdTy2rKPzkw6S4WPPruQE9E1uAgkLnHoS2T9vxM8Kevtf0DAAD/ /wMAUEsDBBQABgAIAAAAIQAPV5tL3QAAAAcBAAAPAAAAZHJzL2Rvd25yZXYueG1sTI/NTsMwEITv SLyDtUjcWjsBWhSyqRD9O3Ci8ABuvCRR43WInTb06XFP5Tia0cw3+WK0rThS7xvHCMlUgSAunWm4 Qvj6XE+eQfig2ejWMSH8kodFcXuT68y4E3/QcRcqEUvYZxqhDqHLpPRlTVb7qeuIo/fteqtDlH0l Ta9Psdy2MlVqJq1uOC7UuqO3msrDbrAIKzWX7baplrPD+me1Ocvl+2Y4I97fja8vIAKN4RqGC35E hyIy7d3AxosWYfKUxiTCQwLiYqvkMX7bI8xTkEUu//MXfwAAAP//AwBQSwECLQAUAAYACAAAACEA toM4kv4AAADhAQAAEwAAAAAAAAAAAAAAAAAAAAAAW0NvbnRlbnRfVHlwZXNdLnhtbFBLAQItABQA BgAIAAAAIQA4/SH/1gAAAJQBAAALAAAAAAAAAAAAAAAAAC8BAABfcmVscy8ucmVsc1BLAQItABQA BgAIAAAAIQBB4bxaqwEAAKIDAAAOAAAAAAAAAAAAAAAAAC4CAABkcnMvZTJvRG9jLnhtbFBLAQIt ABQABgAIAAAAIQAPV5tL3QAAAAcBAAAPAAAAAAAAAAAAAAAAAAUEAABkcnMvZG93bnJldi54bWxQ SwUGAAAAAAQABADzAAAADwUAAAAA " strokecolor="#156082 [3204]" strokeweight="1.5pt">
                 <v:stroke joinstyle="miter"/>
               </v:line>
             </w:pict>
@@ -5565,30 +5700,8 @@
           <w:sz w:val="26"/>
           <w:szCs w:val="26"/>
         </w:rPr>
-        <w:t>8</w:t>
-      </w:r>
-      <w:r>
-        <w:rPr>
-          <w:b/>
-          <w:bCs/>
-          <w:color w:val="000000"/>
-          <w:sz w:val="26"/>
-          <w:szCs w:val="26"/>
-        </w:rPr>
-        <w:t xml:space="preserve">. Deliverable Note and Issues Raised to the </w:t>
-      </w:r>
-      <w:proofErr w:type="spellStart"/>
-      <w:r>
-        <w:rPr>
-          <w:b/>
-          <w:bCs/>
-          <w:color w:val="000000"/>
-          <w:sz w:val="26"/>
-          <w:szCs w:val="26"/>
-        </w:rPr>
-        <w:t>Upgrad</w:t>
-      </w:r>
-      <w:proofErr w:type="spellEnd"/>
+        <w:t>9. Deliverable Note and Issues Raised to the Upgrad</w:t>
+      </w:r>
     </w:p>
     <w:p>
       <w:pPr>
@@ -5606,25 +5719,6 @@
         <w:rPr>
           <w:color w:val="EE0000"/>
         </w:rPr>
-        <w:t>The supplied capstone workflow document does not specify demo_app.py or dashboard screenshots as a project deliverable. These requirements appear later in the evaluation notebook. Since the workflow document is treated as the governing project specification, dashboard screenshots are not included in this report.</w:t>
-      </w:r>
-    </w:p>
-    <w:p>
-      <w:pPr>
-        <w:pStyle w:val="ListParagraph"/>
-        <w:numPr>
-          <w:ilvl w:val="0"/>
-          <w:numId w:val="4"/>
-        </w:numPr>
-        <w:spacing w:after="100" w:line="250" w:lineRule="auto"/>
-        <w:rPr>
-          <w:color w:val="EE0000"/>
-        </w:rPr>
-      </w:pPr>
-      <w:r>
-        <w:rPr>
-          <w:color w:val="EE0000"/>
-        </w:rPr>
         <w:t xml:space="preserve">Issue in the </w:t>
       </w:r>
       <w:proofErr w:type="spellStart"/>
@@ -5639,27 +5733,7 @@
         <w:rPr>
           <w:color w:val="EE0000"/>
         </w:rPr>
-        <w:t>: Ticket ID for Reference: 1264055</w:t>
-      </w:r>
-      <w:r>
-        <w:rPr>
-          <w:color w:val="EE0000"/>
-        </w:rPr>
-        <w:t xml:space="preserve">. Got following response from </w:t>
-      </w:r>
-      <w:proofErr w:type="spellStart"/>
-      <w:r>
-        <w:rPr>
-          <w:color w:val="EE0000"/>
-        </w:rPr>
-        <w:t>Upgrad</w:t>
-      </w:r>
-      <w:proofErr w:type="spellEnd"/>
-      <w:r>
-        <w:rPr>
-          <w:color w:val="EE0000"/>
-        </w:rPr>
-        <w:t xml:space="preserve"> and I did accordingly</w:t>
+        <w:t>: Ticket ID for Reference: 1264055. Got following response from Upgrad and I did accordingly</w:t>
       </w:r>
     </w:p>
     <w:p>
@@ -5677,25 +5751,7 @@
           <w:sz w:val="16"/>
           <w:szCs w:val="16"/>
         </w:rPr>
-        <w:t>“You may use a simple placeholder implementation for '</w:t>
-      </w:r>
-      <w:proofErr w:type="spellStart"/>
-      <w:r>
-        <w:rPr>
-          <w:color w:val="EE0000"/>
-          <w:sz w:val="16"/>
-          <w:szCs w:val="16"/>
-        </w:rPr>
-        <w:t>safety_evaluator_agent</w:t>
-      </w:r>
-      <w:proofErr w:type="spellEnd"/>
-      <w:r>
-        <w:rPr>
-          <w:color w:val="EE0000"/>
-          <w:sz w:val="16"/>
-          <w:szCs w:val="16"/>
-        </w:rPr>
-        <w:t>' while working on the current notebook so that you can continue testing. Once you reach the last notebook, you should replace the placeholder with the actual implementation and re-run the evaluation. </w:t>
+        <w:t>“You may use a simple placeholder implementation for 'safety_evaluator_agent' while working on the current notebook so that you can continue testing. Once you reach the last notebook, you should replace the placeholder with the actual implementation and re-run the evaluation. </w:t>
       </w:r>
       <w:r>
         <w:rPr>
@@ -5704,25 +5760,7 @@
           <w:szCs w:val="16"/>
         </w:rPr>
         <w:br/>
-        <w:t> You will not lose marks for using a temporary placeholder during development, provided the final submission includes the completed  '</w:t>
-      </w:r>
-      <w:proofErr w:type="spellStart"/>
-      <w:r>
-        <w:rPr>
-          <w:color w:val="EE0000"/>
-          <w:sz w:val="16"/>
-          <w:szCs w:val="16"/>
-        </w:rPr>
-        <w:t>safety_evaluator_agent</w:t>
-      </w:r>
-      <w:proofErr w:type="spellEnd"/>
-      <w:r>
-        <w:rPr>
-          <w:color w:val="EE0000"/>
-          <w:sz w:val="16"/>
-          <w:szCs w:val="16"/>
-        </w:rPr>
-        <w:t>' implementation.”</w:t>
+        <w:t> You will not lose marks for using a temporary placeholder during development, provided the final submission includes the completed  'safety_evaluator_agent' implementation.”</w:t>
       </w:r>
     </w:p>
     <w:p>
@@ -5745,51 +5783,7 @@
           <w:sz w:val="18"/>
           <w:szCs w:val="18"/>
         </w:rPr>
-        <w:t xml:space="preserve">Function </w:t>
-      </w:r>
-      <w:proofErr w:type="spellStart"/>
-      <w:r>
-        <w:rPr>
-          <w:color w:val="EE0000"/>
-          <w:sz w:val="18"/>
-          <w:szCs w:val="18"/>
-        </w:rPr>
-        <w:t>get_model</w:t>
-      </w:r>
-      <w:proofErr w:type="spellEnd"/>
-      <w:r>
-        <w:rPr>
-          <w:color w:val="EE0000"/>
-          <w:sz w:val="18"/>
-          <w:szCs w:val="18"/>
-        </w:rPr>
-        <w:t xml:space="preserve">() in utils.py does not work </w:t>
-      </w:r>
-      <w:proofErr w:type="gramStart"/>
-      <w:r>
-        <w:rPr>
-          <w:color w:val="EE0000"/>
-          <w:sz w:val="18"/>
-          <w:szCs w:val="18"/>
-        </w:rPr>
-        <w:t>and also</w:t>
-      </w:r>
-      <w:proofErr w:type="gramEnd"/>
-      <w:r>
-        <w:rPr>
-          <w:color w:val="EE0000"/>
-          <w:sz w:val="18"/>
-          <w:szCs w:val="18"/>
-        </w:rPr>
-        <w:t xml:space="preserve"> refers to an already deprecated gemini-2.0-flash model. I updated the notebooks to use working gemini-2.5-flash model</w:t>
-      </w:r>
-      <w:r>
-        <w:rPr>
-          <w:color w:val="EE0000"/>
-          <w:sz w:val="18"/>
-          <w:szCs w:val="18"/>
-        </w:rPr>
-        <w:t xml:space="preserve"> and used my function instead of </w:t>
+        <w:t xml:space="preserve">Function get_model() in utils.py does not work and also refers to an already deprecated gemini-2.0-flash model. I updated the notebooks to use working gemini-2.5-flash model and used my function instead of </w:t>
       </w:r>
       <w:proofErr w:type="spellStart"/>
       <w:r>
@@ -5808,6 +5802,47 @@
           <w:szCs w:val="18"/>
         </w:rPr>
         <w:t>().</w:t>
+      </w:r>
+    </w:p>
+    <w:p>
+      <w:pPr>
+        <w:pStyle w:val="ListParagraph"/>
+        <w:numPr>
+          <w:ilvl w:val="0"/>
+          <w:numId w:val="5"/>
+        </w:numPr>
+        <w:spacing w:after="100" w:line="250" w:lineRule="auto"/>
+        <w:rPr>
+          <w:color w:val="EE0000"/>
+          <w:sz w:val="18"/>
+          <w:szCs w:val="18"/>
+        </w:rPr>
+      </w:pPr>
+      <w:r>
+        <w:rPr>
+          <w:color w:val="EE0000"/>
+          <w:sz w:val="18"/>
+          <w:szCs w:val="18"/>
+        </w:rPr>
+        <w:t xml:space="preserve">I had to change the demo_app.py to make use of the gemini-2.5-flash model instead of hard coded </w:t>
+      </w:r>
+      <w:proofErr w:type="spellStart"/>
+      <w:r>
+        <w:rPr>
+          <w:color w:val="EE0000"/>
+          <w:sz w:val="18"/>
+          <w:szCs w:val="18"/>
+        </w:rPr>
+        <w:t>Ollama</w:t>
+      </w:r>
+      <w:proofErr w:type="spellEnd"/>
+      <w:r>
+        <w:rPr>
+          <w:color w:val="EE0000"/>
+          <w:sz w:val="18"/>
+          <w:szCs w:val="18"/>
+        </w:rPr>
+        <w:t xml:space="preserve"> model.</w:t>
       </w:r>
     </w:p>
     <w:p>
@@ -6951,6 +6986,7 @@
   <w:style w:type="character" w:default="1" w:styleId="DefaultParagraphFont">
     <w:name w:val="Default Paragraph Font"/>
     <w:uiPriority w:val="1"/>
+    <w:semiHidden/>
     <w:unhideWhenUsed/>
   </w:style>
   <w:style w:type="table" w:default="1" w:styleId="TableNormal">

</xml_diff>